<commit_message>
NFRD v1.2: add watertight guarantee and Accuracy section
Mirrors the FRD v1.2 update. Adds NFR-REL-04 (every output must be a
valid, watertight solid) and a new Accuracy section (NFR-ACC-01:
feature-removal decisions must prioritize minimizing downstream CAE
accuracy impact, not just speed) — both drawn from cross-checking
against a teammate's independent FR draft.
</commit_message>
<xml_diff>
--- a/docs/Non_Functional_Requirements_Document.docx
+++ b/docs/Non_Functional_Requirements_Document.docx
@@ -491,6 +491,136 @@
           </w:p>
         </w:tc>
       </w:tr>
+      <w:tr>
+        <w:tc>
+          <w:tcPr>
+            <w:tcW w:type="dxa" w:w="2059"/>
+            <w:tcBorders>
+              <w:top w:val="single" w:color="000000" w:sz="4"/>
+              <w:left w:val="single" w:color="000000" w:sz="4"/>
+              <w:bottom w:val="single" w:color="000000" w:sz="4"/>
+              <w:right w:val="single" w:color="000000" w:sz="4"/>
+            </w:tcBorders>
+            <w:tcMar>
+              <w:top w:type="dxa" w:w="80"/>
+              <w:left w:type="dxa" w:w="100"/>
+              <w:bottom w:type="dxa" w:w="80"/>
+              <w:right w:type="dxa" w:w="100"/>
+            </w:tcMar>
+            <w:vAlign w:val="center"/>
+          </w:tcPr>
+          <w:p>
+            <w:pPr>
+              <w:jc w:val="left"/>
+            </w:pPr>
+            <w:r>
+              <w:rPr>
+                <w:b w:val="false"/>
+                <w:bCs w:val="false"/>
+                <w:sz w:val="20"/>
+                <w:szCs w:val="20"/>
+              </w:rPr>
+              <w:t xml:space="preserve">Junoh Lee</w:t>
+            </w:r>
+          </w:p>
+        </w:tc>
+        <w:tc>
+          <w:tcPr>
+            <w:tcW w:type="dxa" w:w="1684"/>
+            <w:tcBorders>
+              <w:top w:val="single" w:color="000000" w:sz="4"/>
+              <w:left w:val="single" w:color="000000" w:sz="4"/>
+              <w:bottom w:val="single" w:color="000000" w:sz="4"/>
+              <w:right w:val="single" w:color="000000" w:sz="4"/>
+            </w:tcBorders>
+            <w:tcMar>
+              <w:top w:type="dxa" w:w="80"/>
+              <w:left w:type="dxa" w:w="100"/>
+              <w:bottom w:type="dxa" w:w="80"/>
+              <w:right w:type="dxa" w:w="100"/>
+            </w:tcMar>
+            <w:vAlign w:val="center"/>
+          </w:tcPr>
+          <w:p>
+            <w:pPr>
+              <w:jc w:val="left"/>
+            </w:pPr>
+            <w:r>
+              <w:rPr>
+                <w:b w:val="false"/>
+                <w:bCs w:val="false"/>
+                <w:sz w:val="20"/>
+                <w:szCs w:val="20"/>
+              </w:rPr>
+              <w:t xml:space="preserve">2026-09-11</w:t>
+            </w:r>
+          </w:p>
+        </w:tc>
+        <w:tc>
+          <w:tcPr>
+            <w:tcW w:type="dxa" w:w="3931"/>
+            <w:tcBorders>
+              <w:top w:val="single" w:color="000000" w:sz="4"/>
+              <w:left w:val="single" w:color="000000" w:sz="4"/>
+              <w:bottom w:val="single" w:color="000000" w:sz="4"/>
+              <w:right w:val="single" w:color="000000" w:sz="4"/>
+            </w:tcBorders>
+            <w:tcMar>
+              <w:top w:type="dxa" w:w="80"/>
+              <w:left w:type="dxa" w:w="100"/>
+              <w:bottom w:type="dxa" w:w="80"/>
+              <w:right w:type="dxa" w:w="100"/>
+            </w:tcMar>
+            <w:vAlign w:val="center"/>
+          </w:tcPr>
+          <w:p>
+            <w:pPr>
+              <w:jc w:val="left"/>
+            </w:pPr>
+            <w:r>
+              <w:rPr>
+                <w:b w:val="false"/>
+                <w:bCs w:val="false"/>
+                <w:sz w:val="20"/>
+                <w:szCs w:val="20"/>
+              </w:rPr>
+              <w:t xml:space="preserve">Added watertight output guarantee and CAE-accuracy priority (Accuracy section), cross-checked against teammate's independent FR draft</w:t>
+            </w:r>
+          </w:p>
+        </w:tc>
+        <w:tc>
+          <w:tcPr>
+            <w:tcW w:type="dxa" w:w="1684"/>
+            <w:tcBorders>
+              <w:top w:val="single" w:color="000000" w:sz="4"/>
+              <w:left w:val="single" w:color="000000" w:sz="4"/>
+              <w:bottom w:val="single" w:color="000000" w:sz="4"/>
+              <w:right w:val="single" w:color="000000" w:sz="4"/>
+            </w:tcBorders>
+            <w:tcMar>
+              <w:top w:type="dxa" w:w="80"/>
+              <w:left w:type="dxa" w:w="100"/>
+              <w:bottom w:type="dxa" w:w="80"/>
+              <w:right w:type="dxa" w:w="100"/>
+            </w:tcMar>
+            <w:vAlign w:val="center"/>
+          </w:tcPr>
+          <w:p>
+            <w:pPr>
+              <w:jc w:val="center"/>
+            </w:pPr>
+            <w:r>
+              <w:rPr>
+                <w:b w:val="false"/>
+                <w:bCs w:val="false"/>
+                <w:sz w:val="20"/>
+                <w:szCs w:val="20"/>
+              </w:rPr>
+              <w:t xml:space="preserve">1.2</w:t>
+            </w:r>
+          </w:p>
+        </w:tc>
+      </w:tr>
     </w:tbl>
     <w:p>
       <w:pPr>
@@ -1493,6 +1623,136 @@
           </w:p>
         </w:tc>
       </w:tr>
+      <w:tr>
+        <w:tc>
+          <w:tcPr>
+            <w:tcW w:type="dxa" w:w="2059"/>
+            <w:tcBorders>
+              <w:top w:val="single" w:color="000000" w:sz="4"/>
+              <w:left w:val="single" w:color="000000" w:sz="4"/>
+              <w:bottom w:val="single" w:color="000000" w:sz="4"/>
+              <w:right w:val="single" w:color="000000" w:sz="4"/>
+            </w:tcBorders>
+            <w:tcMar>
+              <w:top w:type="dxa" w:w="80"/>
+              <w:left w:type="dxa" w:w="100"/>
+              <w:bottom w:type="dxa" w:w="80"/>
+              <w:right w:type="dxa" w:w="100"/>
+            </w:tcMar>
+            <w:vAlign w:val="center"/>
+          </w:tcPr>
+          <w:p>
+            <w:pPr>
+              <w:jc w:val="left"/>
+            </w:pPr>
+            <w:r>
+              <w:rPr>
+                <w:b w:val="false"/>
+                <w:bCs w:val="false"/>
+                <w:sz w:val="20"/>
+                <w:szCs w:val="20"/>
+              </w:rPr>
+              <w:t xml:space="preserve">NFR-REL-04</w:t>
+            </w:r>
+          </w:p>
+        </w:tc>
+        <w:tc>
+          <w:tcPr>
+            <w:tcW w:type="dxa" w:w="4024"/>
+            <w:tcBorders>
+              <w:top w:val="single" w:color="000000" w:sz="4"/>
+              <w:left w:val="single" w:color="000000" w:sz="4"/>
+              <w:bottom w:val="single" w:color="000000" w:sz="4"/>
+              <w:right w:val="single" w:color="000000" w:sz="4"/>
+            </w:tcBorders>
+            <w:tcMar>
+              <w:top w:type="dxa" w:w="80"/>
+              <w:left w:type="dxa" w:w="100"/>
+              <w:bottom w:type="dxa" w:w="80"/>
+              <w:right w:type="dxa" w:w="100"/>
+            </w:tcMar>
+            <w:vAlign w:val="center"/>
+          </w:tcPr>
+          <w:p>
+            <w:pPr>
+              <w:jc w:val="left"/>
+            </w:pPr>
+            <w:r>
+              <w:rPr>
+                <w:b w:val="false"/>
+                <w:bCs w:val="false"/>
+                <w:sz w:val="20"/>
+                <w:szCs w:val="20"/>
+              </w:rPr>
+              <w:t xml:space="preserve">Every output CAD model shall be a valid, watertight solid — free of gaps or non-manifold geometry left behind by feature removal.</w:t>
+            </w:r>
+          </w:p>
+        </w:tc>
+        <w:tc>
+          <w:tcPr>
+            <w:tcW w:type="dxa" w:w="1404"/>
+            <w:tcBorders>
+              <w:top w:val="single" w:color="000000" w:sz="4"/>
+              <w:left w:val="single" w:color="000000" w:sz="4"/>
+              <w:bottom w:val="single" w:color="000000" w:sz="4"/>
+              <w:right w:val="single" w:color="000000" w:sz="4"/>
+            </w:tcBorders>
+            <w:tcMar>
+              <w:top w:type="dxa" w:w="80"/>
+              <w:left w:type="dxa" w:w="100"/>
+              <w:bottom w:type="dxa" w:w="80"/>
+              <w:right w:type="dxa" w:w="100"/>
+            </w:tcMar>
+            <w:vAlign w:val="center"/>
+          </w:tcPr>
+          <w:p>
+            <w:pPr>
+              <w:jc w:val="center"/>
+            </w:pPr>
+            <w:r>
+              <w:rPr>
+                <w:b w:val="false"/>
+                <w:bCs w:val="false"/>
+                <w:sz w:val="20"/>
+                <w:szCs w:val="20"/>
+              </w:rPr>
+              <w:t xml:space="preserve">Must</w:t>
+            </w:r>
+          </w:p>
+        </w:tc>
+        <w:tc>
+          <w:tcPr>
+            <w:tcW w:type="dxa" w:w="1872"/>
+            <w:tcBorders>
+              <w:top w:val="single" w:color="000000" w:sz="4"/>
+              <w:left w:val="single" w:color="000000" w:sz="4"/>
+              <w:bottom w:val="single" w:color="000000" w:sz="4"/>
+              <w:right w:val="single" w:color="000000" w:sz="4"/>
+            </w:tcBorders>
+            <w:tcMar>
+              <w:top w:type="dxa" w:w="80"/>
+              <w:left w:type="dxa" w:w="100"/>
+              <w:bottom w:type="dxa" w:w="80"/>
+              <w:right w:type="dxa" w:w="100"/>
+            </w:tcMar>
+            <w:vAlign w:val="center"/>
+          </w:tcPr>
+          <w:p>
+            <w:pPr>
+              <w:jc w:val="left"/>
+            </w:pPr>
+            <w:r>
+              <w:rPr>
+                <w:b w:val="false"/>
+                <w:bCs w:val="false"/>
+                <w:sz w:val="20"/>
+                <w:szCs w:val="20"/>
+              </w:rPr>
+              <w:t xml:space="preserve">Matches FR-DEF-02's watertight healing requirement; cross-checked against teammate's FR draft</w:t>
+            </w:r>
+          </w:p>
+        </w:tc>
+      </w:tr>
     </w:tbl>
     <w:p>
       <w:pPr>
@@ -3465,6 +3725,305 @@
                 <w:szCs w:val="20"/>
               </w:rPr>
               <w:t xml:space="preserve"/>
+            </w:r>
+          </w:p>
+        </w:tc>
+      </w:tr>
+    </w:tbl>
+    <w:p>
+      <w:pPr>
+        <w:pStyle w:val="Heading2"/>
+        <w:spacing w:after="100" w:before="240"/>
+      </w:pPr>
+      <w:r>
+        <w:rPr>
+          <w:sz w:val="24"/>
+          <w:szCs w:val="24"/>
+        </w:rPr>
+        <w:t xml:space="preserve">7. Accuracy</w:t>
+      </w:r>
+    </w:p>
+    <w:tbl>
+      <w:tblPr>
+        <w:tblW w:type="dxa" w:w="9360"/>
+        <w:tblBorders>
+          <w:top w:val="single" w:color="auto" w:sz="4"/>
+          <w:left w:val="single" w:color="auto" w:sz="4"/>
+          <w:bottom w:val="single" w:color="auto" w:sz="4"/>
+          <w:right w:val="single" w:color="auto" w:sz="4"/>
+          <w:insideH w:val="single" w:color="auto" w:sz="4"/>
+          <w:insideV w:val="single" w:color="auto" w:sz="4"/>
+        </w:tblBorders>
+      </w:tblPr>
+      <w:tblGrid>
+        <w:gridCol w:w="2059"/>
+        <w:gridCol w:w="4024"/>
+        <w:gridCol w:w="1404"/>
+        <w:gridCol w:w="1872"/>
+      </w:tblGrid>
+      <w:tr>
+        <w:trPr>
+          <w:tblHeader/>
+        </w:trPr>
+        <w:tc>
+          <w:tcPr>
+            <w:tcW w:type="dxa" w:w="2059"/>
+            <w:tcBorders>
+              <w:top w:val="single" w:color="000000" w:sz="4"/>
+              <w:left w:val="single" w:color="000000" w:sz="4"/>
+              <w:bottom w:val="single" w:color="000000" w:sz="4"/>
+              <w:right w:val="single" w:color="000000" w:sz="4"/>
+            </w:tcBorders>
+            <w:shd w:fill="D9D9D9" w:val="clear"/>
+            <w:tcMar>
+              <w:top w:type="dxa" w:w="80"/>
+              <w:left w:type="dxa" w:w="100"/>
+              <w:bottom w:type="dxa" w:w="80"/>
+              <w:right w:type="dxa" w:w="100"/>
+            </w:tcMar>
+            <w:vAlign w:val="center"/>
+          </w:tcPr>
+          <w:p>
+            <w:pPr>
+              <w:jc w:val="left"/>
+            </w:pPr>
+            <w:r>
+              <w:rPr>
+                <w:b/>
+                <w:bCs/>
+                <w:sz w:val="20"/>
+                <w:szCs w:val="20"/>
+              </w:rPr>
+              <w:t xml:space="preserve">Requirement ID</w:t>
+            </w:r>
+          </w:p>
+        </w:tc>
+        <w:tc>
+          <w:tcPr>
+            <w:tcW w:type="dxa" w:w="4024"/>
+            <w:tcBorders>
+              <w:top w:val="single" w:color="000000" w:sz="4"/>
+              <w:left w:val="single" w:color="000000" w:sz="4"/>
+              <w:bottom w:val="single" w:color="000000" w:sz="4"/>
+              <w:right w:val="single" w:color="000000" w:sz="4"/>
+            </w:tcBorders>
+            <w:shd w:fill="D9D9D9" w:val="clear"/>
+            <w:tcMar>
+              <w:top w:type="dxa" w:w="80"/>
+              <w:left w:type="dxa" w:w="100"/>
+              <w:bottom w:type="dxa" w:w="80"/>
+              <w:right w:type="dxa" w:w="100"/>
+            </w:tcMar>
+            <w:vAlign w:val="center"/>
+          </w:tcPr>
+          <w:p>
+            <w:pPr>
+              <w:jc w:val="left"/>
+            </w:pPr>
+            <w:r>
+              <w:rPr>
+                <w:b/>
+                <w:bCs/>
+                <w:sz w:val="20"/>
+                <w:szCs w:val="20"/>
+              </w:rPr>
+              <w:t xml:space="preserve">Requirement Statement</w:t>
+            </w:r>
+          </w:p>
+        </w:tc>
+        <w:tc>
+          <w:tcPr>
+            <w:tcW w:type="dxa" w:w="1404"/>
+            <w:tcBorders>
+              <w:top w:val="single" w:color="000000" w:sz="4"/>
+              <w:left w:val="single" w:color="000000" w:sz="4"/>
+              <w:bottom w:val="single" w:color="000000" w:sz="4"/>
+              <w:right w:val="single" w:color="000000" w:sz="4"/>
+            </w:tcBorders>
+            <w:shd w:fill="D9D9D9" w:val="clear"/>
+            <w:tcMar>
+              <w:top w:type="dxa" w:w="80"/>
+              <w:left w:type="dxa" w:w="100"/>
+              <w:bottom w:type="dxa" w:w="80"/>
+              <w:right w:type="dxa" w:w="100"/>
+            </w:tcMar>
+            <w:vAlign w:val="center"/>
+          </w:tcPr>
+          <w:p>
+            <w:pPr>
+              <w:jc w:val="left"/>
+            </w:pPr>
+            <w:r>
+              <w:rPr>
+                <w:b/>
+                <w:bCs/>
+                <w:sz w:val="20"/>
+                <w:szCs w:val="20"/>
+              </w:rPr>
+              <w:t xml:space="preserve">Must/Want</w:t>
+            </w:r>
+          </w:p>
+        </w:tc>
+        <w:tc>
+          <w:tcPr>
+            <w:tcW w:type="dxa" w:w="1872"/>
+            <w:tcBorders>
+              <w:top w:val="single" w:color="000000" w:sz="4"/>
+              <w:left w:val="single" w:color="000000" w:sz="4"/>
+              <w:bottom w:val="single" w:color="000000" w:sz="4"/>
+              <w:right w:val="single" w:color="000000" w:sz="4"/>
+            </w:tcBorders>
+            <w:shd w:fill="D9D9D9" w:val="clear"/>
+            <w:tcMar>
+              <w:top w:type="dxa" w:w="80"/>
+              <w:left w:type="dxa" w:w="100"/>
+              <w:bottom w:type="dxa" w:w="80"/>
+              <w:right w:type="dxa" w:w="100"/>
+            </w:tcMar>
+            <w:vAlign w:val="center"/>
+          </w:tcPr>
+          <w:p>
+            <w:pPr>
+              <w:jc w:val="left"/>
+            </w:pPr>
+            <w:r>
+              <w:rPr>
+                <w:b/>
+                <w:bCs/>
+                <w:sz w:val="20"/>
+                <w:szCs w:val="20"/>
+              </w:rPr>
+              <w:t xml:space="preserve">Comments</w:t>
+            </w:r>
+          </w:p>
+        </w:tc>
+      </w:tr>
+      <w:tr>
+        <w:tc>
+          <w:tcPr>
+            <w:tcW w:type="dxa" w:w="2059"/>
+            <w:tcBorders>
+              <w:top w:val="single" w:color="000000" w:sz="4"/>
+              <w:left w:val="single" w:color="000000" w:sz="4"/>
+              <w:bottom w:val="single" w:color="000000" w:sz="4"/>
+              <w:right w:val="single" w:color="000000" w:sz="4"/>
+            </w:tcBorders>
+            <w:tcMar>
+              <w:top w:type="dxa" w:w="80"/>
+              <w:left w:type="dxa" w:w="100"/>
+              <w:bottom w:type="dxa" w:w="80"/>
+              <w:right w:type="dxa" w:w="100"/>
+            </w:tcMar>
+            <w:vAlign w:val="center"/>
+          </w:tcPr>
+          <w:p>
+            <w:pPr>
+              <w:jc w:val="left"/>
+            </w:pPr>
+            <w:r>
+              <w:rPr>
+                <w:b w:val="false"/>
+                <w:bCs w:val="false"/>
+                <w:sz w:val="20"/>
+                <w:szCs w:val="20"/>
+              </w:rPr>
+              <w:t xml:space="preserve">NFR-ACC-01</w:t>
+            </w:r>
+          </w:p>
+        </w:tc>
+        <w:tc>
+          <w:tcPr>
+            <w:tcW w:type="dxa" w:w="4024"/>
+            <w:tcBorders>
+              <w:top w:val="single" w:color="000000" w:sz="4"/>
+              <w:left w:val="single" w:color="000000" w:sz="4"/>
+              <w:bottom w:val="single" w:color="000000" w:sz="4"/>
+              <w:right w:val="single" w:color="000000" w:sz="4"/>
+            </w:tcBorders>
+            <w:tcMar>
+              <w:top w:type="dxa" w:w="80"/>
+              <w:left w:type="dxa" w:w="100"/>
+              <w:bottom w:type="dxa" w:w="80"/>
+              <w:right w:type="dxa" w:w="100"/>
+            </w:tcMar>
+            <w:vAlign w:val="center"/>
+          </w:tcPr>
+          <w:p>
+            <w:pPr>
+              <w:jc w:val="left"/>
+            </w:pPr>
+            <w:r>
+              <w:rPr>
+                <w:b w:val="false"/>
+                <w:bCs w:val="false"/>
+                <w:sz w:val="20"/>
+                <w:szCs w:val="20"/>
+              </w:rPr>
+              <w:t xml:space="preserve">The system's feature-removal decisions shall be optimized to minimize degradation of downstream CAE analysis accuracy, not solely to maximize processing-time reduction.</w:t>
+            </w:r>
+          </w:p>
+        </w:tc>
+        <w:tc>
+          <w:tcPr>
+            <w:tcW w:type="dxa" w:w="1404"/>
+            <w:tcBorders>
+              <w:top w:val="single" w:color="000000" w:sz="4"/>
+              <w:left w:val="single" w:color="000000" w:sz="4"/>
+              <w:bottom w:val="single" w:color="000000" w:sz="4"/>
+              <w:right w:val="single" w:color="000000" w:sz="4"/>
+            </w:tcBorders>
+            <w:tcMar>
+              <w:top w:type="dxa" w:w="80"/>
+              <w:left w:type="dxa" w:w="100"/>
+              <w:bottom w:type="dxa" w:w="80"/>
+              <w:right w:type="dxa" w:w="100"/>
+            </w:tcMar>
+            <w:vAlign w:val="center"/>
+          </w:tcPr>
+          <w:p>
+            <w:pPr>
+              <w:jc w:val="center"/>
+            </w:pPr>
+            <w:r>
+              <w:rPr>
+                <w:b w:val="false"/>
+                <w:bCs w:val="false"/>
+                <w:sz w:val="20"/>
+                <w:szCs w:val="20"/>
+              </w:rPr>
+              <w:t xml:space="preserve">Must</w:t>
+            </w:r>
+          </w:p>
+        </w:tc>
+        <w:tc>
+          <w:tcPr>
+            <w:tcW w:type="dxa" w:w="1872"/>
+            <w:tcBorders>
+              <w:top w:val="single" w:color="000000" w:sz="4"/>
+              <w:left w:val="single" w:color="000000" w:sz="4"/>
+              <w:bottom w:val="single" w:color="000000" w:sz="4"/>
+              <w:right w:val="single" w:color="000000" w:sz="4"/>
+            </w:tcBorders>
+            <w:tcMar>
+              <w:top w:type="dxa" w:w="80"/>
+              <w:left w:type="dxa" w:w="100"/>
+              <w:bottom w:type="dxa" w:w="80"/>
+              <w:right w:type="dxa" w:w="100"/>
+            </w:tcMar>
+            <w:vAlign w:val="center"/>
+          </w:tcPr>
+          <w:p>
+            <w:pPr>
+              <w:jc w:val="left"/>
+            </w:pPr>
+            <w:r>
+              <w:rPr>
+                <w:b w:val="false"/>
+                <w:bCs w:val="false"/>
+                <w:sz w:val="20"/>
+                <w:szCs w:val="20"/>
+              </w:rPr>
+              <w:t xml:space="preserve">Matches FR-FEAT-03; cross-checked against teammate's FR draft</w:t>
             </w:r>
           </w:p>
         </w:tc>

</xml_diff>